<commit_message>
fix(pack): mas aire en la hoja de la carta (4 pt entre parrafos, 6 pt antes de cada apartado)
La compactacion anterior dejaba la carta apretada; en Word quedaban unos
60 pt libres bajo la firma (cartas 10 y 12, las mas largas). Se devuelve el
espacio de 4 pt entre parrafos y se agregan 6 pt antes de los titulos I a IV.
Estimacion con metricas de Calibri: la carta mas larga queda en 94 % de la
hoja (antes 90 %), con unas 3 lineas de reserva. Margenes laterales de 1,5 cm
y titulos dentro del parrafo se mantienen.

Se regeneran los 22 Word, el zip, pack-despido-base64.js y los modelos
gratuitos de descargas/.

Co-Authored-By: Claude Sonnet 5.5 <noreply@anthropic.com>
</commit_message>
<xml_diff>
--- a/api/assets/pack_despido_files/01_Carta_Art161_Necesidades_de_la_Empresa.docx
+++ b/api/assets/pack_despido_files/01_Carta_Art161_Necesidades_de_la_Empresa.docx
@@ -346,7 +346,7 @@
     </w:p>
     <w:p>
       <w:pPr>
-        <w:spacing w:before="40" w:after="60"/>
+        <w:spacing w:before="40" w:after="80"/>
       </w:pPr>
       <w:r>
         <w:rPr>
@@ -427,7 +427,7 @@
     </w:p>
     <w:p>
       <w:pPr>
-        <w:spacing w:before="40" w:after="60"/>
+        <w:spacing w:before="40" w:after="80"/>
       </w:pPr>
       <w:r>
         <w:rPr>
@@ -545,7 +545,7 @@
     </w:p>
     <w:p>
       <w:pPr>
-        <w:spacing w:before="40" w:after="60"/>
+        <w:spacing w:before="40" w:after="80"/>
       </w:pPr>
       <w:r>
         <w:rPr>
@@ -559,7 +559,7 @@
     </w:p>
     <w:p>
       <w:pPr>
-        <w:spacing w:before="40" w:after="60"/>
+        <w:spacing w:before="40" w:after="80"/>
       </w:pPr>
       <w:r>
         <w:rPr>
@@ -668,7 +668,7 @@
     </w:p>
     <w:p>
       <w:pPr>
-        <w:spacing w:before="40" w:after="60"/>
+        <w:spacing w:before="120" w:after="80"/>
       </w:pPr>
       <w:r>
         <w:rPr>
@@ -691,7 +691,7 @@
     </w:p>
     <w:p>
       <w:pPr>
-        <w:spacing w:before="40" w:after="60"/>
+        <w:spacing w:before="120" w:after="80"/>
       </w:pPr>
       <w:r>
         <w:rPr>
@@ -733,7 +733,7 @@
     </w:p>
     <w:p>
       <w:pPr>
-        <w:spacing w:before="40" w:after="60"/>
+        <w:spacing w:before="40" w:after="80"/>
       </w:pPr>
       <w:r>
         <w:rPr>
@@ -766,7 +766,7 @@
     </w:p>
     <w:p>
       <w:pPr>
-        <w:spacing w:before="40" w:after="60"/>
+        <w:spacing w:before="120" w:after="80"/>
       </w:pPr>
       <w:r>
         <w:rPr>
@@ -790,7 +790,7 @@
     <w:p>
       <w:pPr>
         <w:keepNext/>
-        <w:spacing w:before="40" w:after="60"/>
+        <w:spacing w:before="120" w:after="80"/>
       </w:pPr>
       <w:r>
         <w:rPr>
@@ -833,7 +833,7 @@
     <w:p>
       <w:pPr>
         <w:keepNext/>
-        <w:spacing w:before="40" w:after="60"/>
+        <w:spacing w:before="40" w:after="80"/>
       </w:pPr>
       <w:r>
         <w:rPr>
@@ -867,7 +867,7 @@
     <w:p>
       <w:pPr>
         <w:keepNext/>
-        <w:spacing w:before="40" w:after="60"/>
+        <w:spacing w:before="40" w:after="80"/>
       </w:pPr>
       <w:r>
         <w:rPr>

</xml_diff>

<commit_message>
fix(pack): margen de la carta como la hoja de instrucciones y 8 pt antes de cada apartado
Segun las capturas de Word (cartas 10 y 12), la version anterior dejaba
unos 80 pt libres bajo la firma, mas de lo estimado (Word dibuja el texto unos
40 pt mas corto que la medicion con metricas de Calibri). Se usa parte de ese
espacio: margenes laterales de 1,65 cm, igual que la hoja de instrucciones, y
8 pt de aire antes de los titulos I a IV. Estimacion: la carta mas larga en
99 % de la hoja, que en Word equivale a unas 3 o 4 lineas de reserva.

Se regeneran los 22 Word, el zip, pack-despido-base64.js y los modelos
gratuitos de descargas/.

Co-Authored-By: Claude Sonnet 5.5 <noreply@anthropic.com>
</commit_message>
<xml_diff>
--- a/api/assets/pack_despido_files/01_Carta_Art161_Necesidades_de_la_Empresa.docx
+++ b/api/assets/pack_despido_files/01_Carta_Art161_Necesidades_de_la_Empresa.docx
@@ -668,7 +668,7 @@
     </w:p>
     <w:p>
       <w:pPr>
-        <w:spacing w:before="120" w:after="80"/>
+        <w:spacing w:before="160" w:after="80"/>
       </w:pPr>
       <w:r>
         <w:rPr>
@@ -691,7 +691,7 @@
     </w:p>
     <w:p>
       <w:pPr>
-        <w:spacing w:before="120" w:after="80"/>
+        <w:spacing w:before="160" w:after="80"/>
       </w:pPr>
       <w:r>
         <w:rPr>
@@ -766,7 +766,7 @@
     </w:p>
     <w:p>
       <w:pPr>
-        <w:spacing w:before="120" w:after="80"/>
+        <w:spacing w:before="160" w:after="80"/>
       </w:pPr>
       <w:r>
         <w:rPr>
@@ -790,7 +790,7 @@
     <w:p>
       <w:pPr>
         <w:keepNext/>
-        <w:spacing w:before="120" w:after="80"/>
+        <w:spacing w:before="160" w:after="80"/>
       </w:pPr>
       <w:r>
         <w:rPr>
@@ -1100,7 +1100,7 @@
     <w:sectPr>
       <w:footerReference w:type="default" r:id="rId10"/>
       <w:pgSz w:w="12240" w:h="15840"/>
-      <w:pgMar w:top="936" w:right="850" w:bottom="936" w:left="850" w:header="720" w:footer="720" w:gutter="0"/>
+      <w:pgMar w:top="936" w:right="936" w:bottom="936" w:left="936" w:header="720" w:footer="720" w:gutter="0"/>
       <w:cols w:space="720"/>
       <w:docGrid w:linePitch="360"/>
     </w:sectPr>

</xml_diff>